<commit_message>
docs: correct Templates #15 — kind is free-text inline-edit, not a dropdown
Earlier framing said the catalog was too narrow with two fix paths
(expand catalog OR keep narrow + use Custom). User confirmed via
side-by-side: our build uses a free-text inline-editable input for
kind, not a dropdown. The portal's dropdown approach is the wrong
UX paradigm.

Updated finding to reflect the right reference: replace the dropdown
with an inline-edit text input matching the house pattern from every
other editable field on the template detail. No fixed catalog —
operators write whatever describes the work.

Also flagged that the "Click any field to edit" hint is lying about
the kind field's behavior — clicking it opens a dropdown instead of
becoming inline-editable like the hint promises.

Subtitle updated to match.

Co-Authored-By: Claude Opus 4.7 <noreply@anthropic.com>
</commit_message>
<xml_diff>
--- a/docs/qa-comparison/templates-page-qa-round4-deep.docx
+++ b/docs/qa-comparison/templates-page-qa-round4-deep.docx
@@ -55,7 +55,7 @@
           <w:color w:val="5A5A5A"/>
           <w:sz w:val="24"/>
         </w:rPr>
-        <w:t>Round 4 deep audit. RESET TO DEFAULT shipped on built-in templates. Kind catalog is too narrow (6 entries doesn't cover the agency's template mix — Account Management is currently tagged "Web Development" because there's no right option). Phase subtitles partially migrated. Eyebrow active/archived split missing. Archived collapsible group missing from list.</w:t>
+        <w:t>Round 4 deep audit. RESET TO DEFAULT shipped on built-in templates. Kind field uses a fixed-catalog dropdown instead of a free-text inline-editable input (our build's pattern), so Account Management currently reads "Web Development" because there's no right option in the dropdown — and the "Click any field to edit" hint lies about the field's behavior. Phase subtitles partially migrated. Eyebrow active/archived split missing. Archived collapsible group missing from list.</w:t>
       </w:r>
     </w:p>
     <w:p>
@@ -1205,7 +1205,7 @@
                 <w:color w:val="1A1A1A"/>
                 <w:sz w:val="22"/>
               </w:rPr>
-              <w:t>#15. Kind catalog dropdown is too narrow for the agency's template mix</w:t>
+              <w:t>#15. Kind field should be a free-text inline-editable input, not a dropdown</w:t>
             </w:r>
           </w:p>
         </w:tc>
@@ -1229,7 +1229,7 @@
           <w:color w:val="1A1A1A"/>
           <w:sz w:val="20"/>
         </w:rPr>
-        <w:t>Not previously documented; user-flagged in round 4 follow-up. Round 2 #2 was treating the symptom (some templates default to "general"); this is the root cause.</w:t>
+        <w:t>Not previously documented; user-flagged in round 4 follow-up. Round 2 #2 was treating the symptom (some templates default to "general"); the actual fix is a different UX pattern entirely.</w:t>
       </w:r>
     </w:p>
     <w:p>
@@ -1250,7 +1250,7 @@
           <w:color w:val="1A1A1A"/>
           <w:sz w:val="20"/>
         </w:rPr>
-        <w:t>Click on the kind pill in a template detail header opens a dropdown with 6 options: Web Development, SEO, Content, Brand, Paid Media, Custom. The agency's template mix includes Account Management, HR / Resourcing, Finance / Billing, Email Marketing, Hosting / IT, PR / Communications, Organic Social Media — none of which fit cleanly into those 6 kinds. Result: many templates fall back to "Custom" or get force-fit into the wrong kind. Account Management is currently tagged "Web Development" which is plainly wrong — it's tagged that way because no "Account Management" or "Operations" kind exists in the catalog.</w:t>
+        <w:t>Click on the kind pill in a template detail header opens a dropdown with 6 fixed options (Web Development, SEO, Content, Brand, Paid Media, Custom). Our build doesn't have this dropdown — kind is a free-text inline-editable input. Click the field, it becomes a text input, type whatever fits the template (Web Development, Account Management, HR / Resourcing, Hosting &amp; IT, etc.), hit Enter, done. The portal's dropdown approach forces every template into one of 6 buckets, which is why Account Management currently reads "Web Development" (plainly wrong — there's no right option in the dropdown). The portal also still shows the "↓ Click any field to edit" hint, which promises inline-edit but the field doesn't actually behave that way — clicking it opens a dropdown instead of becoming inline-editable. The hint is lying about the field's behavior.</w:t>
       </w:r>
     </w:p>
     <w:p>
@@ -1271,7 +1271,7 @@
           <w:color w:val="1A1A1A"/>
           <w:sz w:val="20"/>
         </w:rPr>
-        <w:t>Expand the catalog to cover the agency's actual template kinds. Suggested additions: Operations, Account Management, HR / Resourcing, Finance / Billing, Email, Social, Communications, Hosting / IT, Design. Alternative: keep the catalog narrow (current 6) and rely on "Custom" with a free-text label per template. Either way, retag the existing templates so the kind pill matches what the work actually is — Account Management should not be "Web Development".</w:t>
+        <w:t>Replace the dropdown with an inline-edit text input matching the house pattern from every other editable field on the template detail. Click the field, it becomes a text input pre-filled with the current value, type to change, Enter or blur to save. No fixed catalog — operators write whatever describes the work. Keep the icon next to the kind for visual cue (the monitor / palette / etc.), but the text portion is free-form. Once shipped, retag the existing templates so kind reads what the work actually is — Account Management to "Account Management", HR / Resourcing to "HR &amp; Resourcing", and so on.</w:t>
       </w:r>
     </w:p>
     <w:p>
@@ -3381,7 +3381,7 @@
                 <w:color w:val="1A1A1A"/>
                 <w:sz w:val="21"/>
               </w:rPr>
-              <w:t>#15. Kind catalog dropdown is too narrow for the agency's template mix</w:t>
+              <w:t>#15. Kind field should be a free-text inline-editable input, not a dropdown</w:t>
             </w:r>
             <w:r>
               <w:br/>
@@ -3391,7 +3391,7 @@
                 <w:color w:val="1A1A1A"/>
                 <w:sz w:val="20"/>
               </w:rPr>
-              <w:t>Expand the catalog to cover the agency's actual template kinds. Suggested additions: Operations, Account Management, HR / Resourcing, Finance / Billing, Email, Social, Communications, Hosting / IT, Design. Alternative: keep the catalog narrow (current 6) and rely on "Custom" with a free-text label per template. Either way, retag the existing templates so the kind pill matches what the work actually is — Account Management should not be "Web Development".</w:t>
+              <w:t>Replace the dropdown with an inline-edit text input matching the house pattern from every other editable field on the template detail. Click the field, it becomes a text input pre-filled with the current value, type to change, Enter or blur to save. No fixed catalog — operators write whatever describes the work. Keep the icon next to the kind for visual cue (the monitor / palette / etc.), but the text portion is free-form. Once shipped, retag the existing templates so kind reads what the work actually is — Account Management to "Account Management", HR / Resourcing to "HR &amp; Resourcing", and so on.</w:t>
             </w:r>
           </w:p>
         </w:tc>

</xml_diff>

<commit_message>
docs: refine Templates #8 — USE TEMPLATE button needs clarity or removal
User-flagged: \"I don't know what the 'use template' button is for
because it's not on the original version of the site.\" The tooltip
on hover (\"Apply this template's phases to a project\") is itself
vague.

Updated finding from LOW FYI to MED OPEN. The tooltip doesn't say
which project the button applies to, doesn't confirm what happens
to existing cards on the target board, doesn't say whether it can
be undone. Our build's pattern: templates apply only at service-
creation time. Portal is exposing a separate 'apply to existing
project' flow that's both new and unclear.

Two fix paths documented:
(a) Remove the button (match our build, keep one pattern operators
    learn once)
(b) Keep but clarify (better tooltip, project selector, conflict
    handling, undo path)

Where to see line refined to point at the actual button + the hover
tooltip behavior.

Co-Authored-By: Claude Opus 4.7 <noreply@anthropic.com>
</commit_message>
<xml_diff>
--- a/docs/qa-comparison/templates-page-qa-round4-deep.docx
+++ b/docs/qa-comparison/templates-page-qa-round4-deep.docx
@@ -1080,7 +1080,7 @@
               <w:bottom w:val="nil"/>
               <w:right w:val="nil"/>
             </w:tcBorders>
-            <w:shd w:val="clear" w:color="auto" w:fill="4A8F4A"/>
+            <w:shd w:val="clear" w:color="auto" w:fill="D69D2A"/>
             <w:vAlign w:val="center"/>
           </w:tcPr>
           <w:p>
@@ -1094,7 +1094,7 @@
                 <w:color w:val="FFFFFF"/>
                 <w:sz w:val="16"/>
               </w:rPr>
-              <w:t>LOW</w:t>
+              <w:t>MED</w:t>
             </w:r>
           </w:p>
         </w:tc>
@@ -1146,7 +1146,7 @@
                 <w:color w:val="1A1A1A"/>
                 <w:sz w:val="22"/>
               </w:rPr>
-              <w:t>#8. USE TEMPLATE button on portal not on ours</w:t>
+              <w:t>#8. USE TEMPLATE button: unclear what it does + not in our build</w:t>
             </w:r>
           </w:p>
         </w:tc>
@@ -1170,7 +1170,7 @@
           <w:color w:val="1A1A1A"/>
           <w:sz w:val="20"/>
         </w:rPr>
-        <w:t>Templates page → click any template → detail header → 'Click any field to edit' pill.</w:t>
+        <w:t>Templates page → click any template → detail header → '▷ USE TEMPLATE' button (between the 'Click any field to edit' pill and ARCHIVE). Hover the button to see the tooltip ('Apply this template's phases to a project').</w:t>
       </w:r>
     </w:p>
     <w:p>
@@ -1212,7 +1212,7 @@
           <w:color w:val="1A1A1A"/>
           <w:sz w:val="20"/>
         </w:rPr>
-        <w:t>Portal renders "▶ USE TEMPLATE" button in the detail header. Our build doesn't have this button. Either portal added a feature out of parity scope, or this is something we should add to our build to match.</w:t>
+        <w:t>Portal renders a '▷ USE TEMPLATE' button in the template detail header. Our build doesn't have this button. The tooltip on hover reads 'Apply this template's phases to a project' — vague and doesn't explain the flow that fires on click. Our build's pattern: when you create a service for a client, you pick a template AT CREATION TIME, and the template seeds the kanban board with the right phases and example tasks. Portal is exposing a separate 'apply to existing project' flow that doesn't exist in our build, with a tooltip that doesn't explain what 'project' it applies to or what happens to the existing kanban contents (overwrite? merge? duplicate?).</w:t>
       </w:r>
     </w:p>
     <w:p>
@@ -1233,7 +1233,7 @@
           <w:color w:val="1A1A1A"/>
           <w:sz w:val="20"/>
         </w:rPr>
-        <w:t>Confirm intent: keep portal-only or add to our build for parity in the other direction. Document the decision.</w:t>
+        <w:t>Two paths. (a) Remove the button — keep parity with our build, where templates apply only at service-creation time. Operators learn one pattern. (b) Keep the button but make it actually useful: clarify the tooltip ('Add this template's phases as a new section to an existing project's kanban'), confirm what 'project' it targets (selector? dropdown?), confirm what happens to existing cards on the target board (preserved? merged?), confirm whether this can be undone. Document the decision either way so the dev knows whether to keep building or pull it.</w:t>
       </w:r>
     </w:p>
     <w:p>
@@ -3520,7 +3520,7 @@
               <w:bottom w:val="nil"/>
               <w:right w:val="nil"/>
             </w:tcBorders>
-            <w:shd w:val="clear" w:color="auto" w:fill="4A8F4A"/>
+            <w:shd w:val="clear" w:color="auto" w:fill="D69D2A"/>
             <w:vAlign w:val="top"/>
           </w:tcPr>
           <w:p>
@@ -3534,7 +3534,7 @@
                 <w:color w:val="FFFFFF"/>
                 <w:sz w:val="16"/>
               </w:rPr>
-              <w:t>LOW</w:t>
+              <w:t>MED</w:t>
             </w:r>
           </w:p>
         </w:tc>
@@ -3559,7 +3559,7 @@
                 <w:color w:val="1A1A1A"/>
                 <w:sz w:val="21"/>
               </w:rPr>
-              <w:t>#8. USE TEMPLATE button on portal not on ours</w:t>
+              <w:t>#8. USE TEMPLATE button: unclear what it does + not in our build</w:t>
             </w:r>
             <w:r>
               <w:br/>
@@ -3569,7 +3569,7 @@
                 <w:color w:val="1A1A1A"/>
                 <w:sz w:val="20"/>
               </w:rPr>
-              <w:t>Confirm intent: keep portal-only or add to our build for parity in the other direction. Document the decision.</w:t>
+              <w:t>Two paths. (a) Remove the button — keep parity with our build, where templates apply only at service-creation time. Operators learn one pattern. (b) Keep the button but make it actually useful: clarify the tooltip ('Add this template's phases as a new section to an existing project's kanban'), confirm what 'project' it targets (selector? dropdown?), confirm what happens to existing cards on the target board (preserved? merged?), confirm whether this can be undone. Document the decision either way so the dev knows whether to keep building or pull it.</w:t>
             </w:r>
           </w:p>
         </w:tc>

</xml_diff>